<commit_message>
Add screenshots and rebuild report with figures
</commit_message>
<xml_diff>
--- a/docs/MLOps_Assignment1_Report.docx
+++ b/docs/MLOps_Assignment1_Report.docx
@@ -418,6 +418,108 @@
       </w:r>
     </w:p>
     <w:p>
+      <w:pPr>
+        <w:jc w:val="center"/>
+      </w:pPr>
+      <w:r>
+        <w:drawing>
+          <wp:inline xmlns:a="http://schemas.openxmlformats.org/drawingml/2006/main" xmlns:pic="http://schemas.openxmlformats.org/drawingml/2006/picture">
+            <wp:extent cx="5669280" cy="2606274"/>
+            <wp:docPr id="1" name="Picture 1"/>
+            <wp:cNvGraphicFramePr>
+              <a:graphicFrameLocks noChangeAspect="1"/>
+            </wp:cNvGraphicFramePr>
+            <a:graphic>
+              <a:graphicData uri="http://schemas.openxmlformats.org/drawingml/2006/picture">
+                <pic:pic>
+                  <pic:nvPicPr>
+                    <pic:cNvPr id="0" name="vm_data_eda.png"/>
+                    <pic:cNvPicPr/>
+                  </pic:nvPicPr>
+                  <pic:blipFill>
+                    <a:blip r:embed="rId9"/>
+                    <a:stretch>
+                      <a:fillRect/>
+                    </a:stretch>
+                  </pic:blipFill>
+                  <pic:spPr>
+                    <a:xfrm>
+                      <a:off x="0" y="0"/>
+                      <a:ext cx="5669280" cy="2606274"/>
+                    </a:xfrm>
+                    <a:prstGeom prst="rect"/>
+                  </pic:spPr>
+                </pic:pic>
+              </a:graphicData>
+            </a:graphic>
+          </wp:inline>
+        </w:drawing>
+      </w:r>
+    </w:p>
+    <w:p>
+      <w:pPr>
+        <w:jc w:val="center"/>
+      </w:pPr>
+      <w:r>
+        <w:rPr>
+          <w:i/>
+          <w:sz w:val="18"/>
+        </w:rPr>
+        <w:t>Figure 1 - Output of src.data and src.eda</w:t>
+      </w:r>
+    </w:p>
+    <w:p>
+      <w:pPr>
+        <w:jc w:val="center"/>
+      </w:pPr>
+      <w:r>
+        <w:drawing>
+          <wp:inline xmlns:a="http://schemas.openxmlformats.org/drawingml/2006/main" xmlns:pic="http://schemas.openxmlformats.org/drawingml/2006/picture">
+            <wp:extent cx="5669280" cy="2513063"/>
+            <wp:docPr id="2" name="Picture 2"/>
+            <wp:cNvGraphicFramePr>
+              <a:graphicFrameLocks noChangeAspect="1"/>
+            </wp:cNvGraphicFramePr>
+            <a:graphic>
+              <a:graphicData uri="http://schemas.openxmlformats.org/drawingml/2006/picture">
+                <pic:pic>
+                  <pic:nvPicPr>
+                    <pic:cNvPr id="0" name="vm_train_tests.png"/>
+                    <pic:cNvPicPr/>
+                  </pic:nvPicPr>
+                  <pic:blipFill>
+                    <a:blip r:embed="rId10"/>
+                    <a:stretch>
+                      <a:fillRect/>
+                    </a:stretch>
+                  </pic:blipFill>
+                  <pic:spPr>
+                    <a:xfrm>
+                      <a:off x="0" y="0"/>
+                      <a:ext cx="5669280" cy="2513063"/>
+                    </a:xfrm>
+                    <a:prstGeom prst="rect"/>
+                  </pic:spPr>
+                </pic:pic>
+              </a:graphicData>
+            </a:graphic>
+          </wp:inline>
+        </w:drawing>
+      </w:r>
+    </w:p>
+    <w:p>
+      <w:pPr>
+        <w:jc w:val="center"/>
+      </w:pPr>
+      <w:r>
+        <w:rPr>
+          <w:i/>
+          <w:sz w:val="18"/>
+        </w:rPr>
+        <w:t>Figure 2 - Output of src.train, pytest and src.predict</w:t>
+      </w:r>
+    </w:p>
+    <w:p>
       <w:r>
         <w:br w:type="page"/>
       </w:r>
@@ -527,7 +629,7 @@
         <w:drawing>
           <wp:inline xmlns:a="http://schemas.openxmlformats.org/drawingml/2006/main" xmlns:pic="http://schemas.openxmlformats.org/drawingml/2006/picture">
             <wp:extent cx="3108960" cy="2487168"/>
-            <wp:docPr id="1" name="Picture 1"/>
+            <wp:docPr id="3" name="Picture 3"/>
             <wp:cNvGraphicFramePr>
               <a:graphicFrameLocks noChangeAspect="1"/>
             </wp:cNvGraphicFramePr>
@@ -539,7 +641,7 @@
                     <pic:cNvPicPr/>
                   </pic:nvPicPr>
                   <pic:blipFill>
-                    <a:blip r:embed="rId9"/>
+                    <a:blip r:embed="rId11"/>
                     <a:stretch>
                       <a:fillRect/>
                     </a:stretch>
@@ -567,7 +669,7 @@
           <w:i/>
           <w:sz w:val="18"/>
         </w:rPr>
-        <w:t>Figure 1 - Class balance of the binary target</w:t>
+        <w:t>Figure 3 - Class balance of the binary target</w:t>
       </w:r>
     </w:p>
     <w:p>
@@ -578,7 +680,7 @@
         <w:drawing>
           <wp:inline xmlns:a="http://schemas.openxmlformats.org/drawingml/2006/main" xmlns:pic="http://schemas.openxmlformats.org/drawingml/2006/picture">
             <wp:extent cx="5669280" cy="3239589"/>
-            <wp:docPr id="2" name="Picture 2"/>
+            <wp:docPr id="4" name="Picture 4"/>
             <wp:cNvGraphicFramePr>
               <a:graphicFrameLocks noChangeAspect="1"/>
             </wp:cNvGraphicFramePr>
@@ -590,7 +692,7 @@
                     <pic:cNvPicPr/>
                   </pic:nvPicPr>
                   <pic:blipFill>
-                    <a:blip r:embed="rId10"/>
+                    <a:blip r:embed="rId12"/>
                     <a:stretch>
                       <a:fillRect/>
                     </a:stretch>
@@ -618,7 +720,7 @@
           <w:i/>
           <w:sz w:val="18"/>
         </w:rPr>
-        <w:t>Figure 2 - Distribution of numeric features by class</w:t>
+        <w:t>Figure 4 - Distribution of numeric features by class</w:t>
       </w:r>
     </w:p>
     <w:p>
@@ -629,7 +731,7 @@
         <w:drawing>
           <wp:inline xmlns:a="http://schemas.openxmlformats.org/drawingml/2006/main" xmlns:pic="http://schemas.openxmlformats.org/drawingml/2006/picture">
             <wp:extent cx="4937760" cy="4039985"/>
-            <wp:docPr id="3" name="Picture 3"/>
+            <wp:docPr id="5" name="Picture 5"/>
             <wp:cNvGraphicFramePr>
               <a:graphicFrameLocks noChangeAspect="1"/>
             </wp:cNvGraphicFramePr>
@@ -641,7 +743,7 @@
                     <pic:cNvPicPr/>
                   </pic:nvPicPr>
                   <pic:blipFill>
-                    <a:blip r:embed="rId11"/>
+                    <a:blip r:embed="rId13"/>
                     <a:stretch>
                       <a:fillRect/>
                     </a:stretch>
@@ -669,7 +771,7 @@
           <w:i/>
           <w:sz w:val="18"/>
         </w:rPr>
-        <w:t>Figure 3 - Correlation heatmap</w:t>
+        <w:t>Figure 5 - Correlation heatmap</w:t>
       </w:r>
     </w:p>
     <w:p>
@@ -680,7 +782,7 @@
         <w:drawing>
           <wp:inline xmlns:a="http://schemas.openxmlformats.org/drawingml/2006/main" xmlns:pic="http://schemas.openxmlformats.org/drawingml/2006/picture">
             <wp:extent cx="5669280" cy="2834640"/>
-            <wp:docPr id="4" name="Picture 4"/>
+            <wp:docPr id="6" name="Picture 6"/>
             <wp:cNvGraphicFramePr>
               <a:graphicFrameLocks noChangeAspect="1"/>
             </wp:cNvGraphicFramePr>
@@ -692,7 +794,7 @@
                     <pic:cNvPicPr/>
                   </pic:nvPicPr>
                   <pic:blipFill>
-                    <a:blip r:embed="rId12"/>
+                    <a:blip r:embed="rId14"/>
                     <a:stretch>
                       <a:fillRect/>
                     </a:stretch>
@@ -720,7 +822,7 @@
           <w:i/>
           <w:sz w:val="18"/>
         </w:rPr>
-        <w:t>Figure 4 - Categorical features versus the target</w:t>
+        <w:t>Figure 6 - Categorical features versus the target</w:t>
       </w:r>
     </w:p>
     <w:p>
@@ -1223,11 +1325,38 @@
         <w:jc w:val="center"/>
       </w:pPr>
       <w:r>
-        <w:rPr>
-          <w:b/>
-          <w:color w:val="C0392B"/>
-        </w:rPr>
-        <w:t>[Insert screenshot: screenshots/mlflow_experiments.png - Figure 5 - MLflow experiment with both runs]</w:t>
+        <w:drawing>
+          <wp:inline xmlns:a="http://schemas.openxmlformats.org/drawingml/2006/main" xmlns:pic="http://schemas.openxmlformats.org/drawingml/2006/picture">
+            <wp:extent cx="5486400" cy="2743200"/>
+            <wp:docPr id="7" name="Picture 7"/>
+            <wp:cNvGraphicFramePr>
+              <a:graphicFrameLocks noChangeAspect="1"/>
+            </wp:cNvGraphicFramePr>
+            <a:graphic>
+              <a:graphicData uri="http://schemas.openxmlformats.org/drawingml/2006/picture">
+                <pic:pic>
+                  <pic:nvPicPr>
+                    <pic:cNvPr id="0" name="mlflow_experiments.png"/>
+                    <pic:cNvPicPr/>
+                  </pic:nvPicPr>
+                  <pic:blipFill>
+                    <a:blip r:embed="rId15"/>
+                    <a:stretch>
+                      <a:fillRect/>
+                    </a:stretch>
+                  </pic:blipFill>
+                  <pic:spPr>
+                    <a:xfrm>
+                      <a:off x="0" y="0"/>
+                      <a:ext cx="5486400" cy="2743200"/>
+                    </a:xfrm>
+                    <a:prstGeom prst="rect"/>
+                  </pic:spPr>
+                </pic:pic>
+              </a:graphicData>
+            </a:graphic>
+          </wp:inline>
+        </w:drawing>
       </w:r>
     </w:p>
     <w:p>
@@ -1236,10 +1365,49 @@
       </w:pPr>
       <w:r>
         <w:rPr>
-          <w:b/>
-          <w:color w:val="C0392B"/>
+          <w:i/>
+          <w:sz w:val="18"/>
         </w:rPr>
-        <w:t>[Insert screenshot: screenshots/mlflow_compare.png - Figure 6 - Run comparison]</w:t>
+        <w:t>Figure 7 - MLflow experiment with both runs</w:t>
+      </w:r>
+    </w:p>
+    <w:p>
+      <w:pPr>
+        <w:jc w:val="center"/>
+      </w:pPr>
+      <w:r>
+        <w:drawing>
+          <wp:inline xmlns:a="http://schemas.openxmlformats.org/drawingml/2006/main" xmlns:pic="http://schemas.openxmlformats.org/drawingml/2006/picture">
+            <wp:extent cx="5486400" cy="2775010"/>
+            <wp:docPr id="8" name="Picture 8"/>
+            <wp:cNvGraphicFramePr>
+              <a:graphicFrameLocks noChangeAspect="1"/>
+            </wp:cNvGraphicFramePr>
+            <a:graphic>
+              <a:graphicData uri="http://schemas.openxmlformats.org/drawingml/2006/picture">
+                <pic:pic>
+                  <pic:nvPicPr>
+                    <pic:cNvPr id="0" name="mlflow_compare.png"/>
+                    <pic:cNvPicPr/>
+                  </pic:nvPicPr>
+                  <pic:blipFill>
+                    <a:blip r:embed="rId16"/>
+                    <a:stretch>
+                      <a:fillRect/>
+                    </a:stretch>
+                  </pic:blipFill>
+                  <pic:spPr>
+                    <a:xfrm>
+                      <a:off x="0" y="0"/>
+                      <a:ext cx="5486400" cy="2775010"/>
+                    </a:xfrm>
+                    <a:prstGeom prst="rect"/>
+                  </pic:spPr>
+                </pic:pic>
+              </a:graphicData>
+            </a:graphic>
+          </wp:inline>
+        </w:drawing>
       </w:r>
     </w:p>
     <w:p>
@@ -1248,10 +1416,61 @@
       </w:pPr>
       <w:r>
         <w:rPr>
-          <w:b/>
-          <w:color w:val="C0392B"/>
+          <w:i/>
+          <w:sz w:val="18"/>
         </w:rPr>
-        <w:t>[Insert screenshot: screenshots/mlflow_run_artifacts.png - Figure 7 - Artifacts of the selected run (ROC curve, confusion matrix, model)]</w:t>
+        <w:t>Figure 8 - Run comparison</w:t>
+      </w:r>
+    </w:p>
+    <w:p>
+      <w:pPr>
+        <w:jc w:val="center"/>
+      </w:pPr>
+      <w:r>
+        <w:drawing>
+          <wp:inline xmlns:a="http://schemas.openxmlformats.org/drawingml/2006/main" xmlns:pic="http://schemas.openxmlformats.org/drawingml/2006/picture">
+            <wp:extent cx="5486400" cy="2796041"/>
+            <wp:docPr id="9" name="Picture 9"/>
+            <wp:cNvGraphicFramePr>
+              <a:graphicFrameLocks noChangeAspect="1"/>
+            </wp:cNvGraphicFramePr>
+            <a:graphic>
+              <a:graphicData uri="http://schemas.openxmlformats.org/drawingml/2006/picture">
+                <pic:pic>
+                  <pic:nvPicPr>
+                    <pic:cNvPr id="0" name="mlflow_run_artifacts.png"/>
+                    <pic:cNvPicPr/>
+                  </pic:nvPicPr>
+                  <pic:blipFill>
+                    <a:blip r:embed="rId17"/>
+                    <a:stretch>
+                      <a:fillRect/>
+                    </a:stretch>
+                  </pic:blipFill>
+                  <pic:spPr>
+                    <a:xfrm>
+                      <a:off x="0" y="0"/>
+                      <a:ext cx="5486400" cy="2796041"/>
+                    </a:xfrm>
+                    <a:prstGeom prst="rect"/>
+                  </pic:spPr>
+                </pic:pic>
+              </a:graphicData>
+            </a:graphic>
+          </wp:inline>
+        </w:drawing>
+      </w:r>
+    </w:p>
+    <w:p>
+      <w:pPr>
+        <w:jc w:val="center"/>
+      </w:pPr>
+      <w:r>
+        <w:rPr>
+          <w:i/>
+          <w:sz w:val="18"/>
+        </w:rPr>
+        <w:t>Figure 9 - Artifacts of the selected run (ROC curve, confusion matrix, model)</w:t>
       </w:r>
     </w:p>
     <w:p>
@@ -1354,11 +1573,50 @@
         <w:jc w:val="center"/>
       </w:pPr>
       <w:r>
+        <w:drawing>
+          <wp:inline xmlns:a="http://schemas.openxmlformats.org/drawingml/2006/main" xmlns:pic="http://schemas.openxmlformats.org/drawingml/2006/picture">
+            <wp:extent cx="5486400" cy="1799102"/>
+            <wp:docPr id="10" name="Picture 10"/>
+            <wp:cNvGraphicFramePr>
+              <a:graphicFrameLocks noChangeAspect="1"/>
+            </wp:cNvGraphicFramePr>
+            <a:graphic>
+              <a:graphicData uri="http://schemas.openxmlformats.org/drawingml/2006/picture">
+                <pic:pic>
+                  <pic:nvPicPr>
+                    <pic:cNvPr id="0" name="ci_run.png"/>
+                    <pic:cNvPicPr/>
+                  </pic:nvPicPr>
+                  <pic:blipFill>
+                    <a:blip r:embed="rId18"/>
+                    <a:stretch>
+                      <a:fillRect/>
+                    </a:stretch>
+                  </pic:blipFill>
+                  <pic:spPr>
+                    <a:xfrm>
+                      <a:off x="0" y="0"/>
+                      <a:ext cx="5486400" cy="1799102"/>
+                    </a:xfrm>
+                    <a:prstGeom prst="rect"/>
+                  </pic:spPr>
+                </pic:pic>
+              </a:graphicData>
+            </a:graphic>
+          </wp:inline>
+        </w:drawing>
+      </w:r>
+    </w:p>
+    <w:p>
+      <w:pPr>
+        <w:jc w:val="center"/>
+      </w:pPr>
+      <w:r>
         <w:rPr>
-          <w:b/>
-          <w:color w:val="C0392B"/>
+          <w:i/>
+          <w:sz w:val="18"/>
         </w:rPr>
-        <w:t>[Insert screenshot: screenshots/ci_run.png - Figure 8 - Successful GitHub Actions run (build passed in 1m 32s, 1 artifact)]</w:t>
+        <w:t>Figure 10 - Successful GitHub Actions runs (CI #1 and CI #2)</w:t>
       </w:r>
     </w:p>
     <w:p>
@@ -1546,11 +1804,38 @@
         <w:jc w:val="center"/>
       </w:pPr>
       <w:r>
-        <w:rPr>
-          <w:b/>
-          <w:color w:val="C0392B"/>
-        </w:rPr>
-        <w:t>[Insert screenshot: screenshots/docker_build_run.png - Figure 9 - Docker build, run and a /predict request]</w:t>
+        <w:drawing>
+          <wp:inline xmlns:a="http://schemas.openxmlformats.org/drawingml/2006/main" xmlns:pic="http://schemas.openxmlformats.org/drawingml/2006/picture">
+            <wp:extent cx="5486400" cy="2198562"/>
+            <wp:docPr id="11" name="Picture 11"/>
+            <wp:cNvGraphicFramePr>
+              <a:graphicFrameLocks noChangeAspect="1"/>
+            </wp:cNvGraphicFramePr>
+            <a:graphic>
+              <a:graphicData uri="http://schemas.openxmlformats.org/drawingml/2006/picture">
+                <pic:pic>
+                  <pic:nvPicPr>
+                    <pic:cNvPr id="0" name="docker_build_run.png"/>
+                    <pic:cNvPicPr/>
+                  </pic:nvPicPr>
+                  <pic:blipFill>
+                    <a:blip r:embed="rId19"/>
+                    <a:stretch>
+                      <a:fillRect/>
+                    </a:stretch>
+                  </pic:blipFill>
+                  <pic:spPr>
+                    <a:xfrm>
+                      <a:off x="0" y="0"/>
+                      <a:ext cx="5486400" cy="2198562"/>
+                    </a:xfrm>
+                    <a:prstGeom prst="rect"/>
+                  </pic:spPr>
+                </pic:pic>
+              </a:graphicData>
+            </a:graphic>
+          </wp:inline>
+        </w:drawing>
       </w:r>
     </w:p>
     <w:p>
@@ -1559,10 +1844,61 @@
       </w:pPr>
       <w:r>
         <w:rPr>
-          <w:b/>
-          <w:color w:val="C0392B"/>
+          <w:i/>
+          <w:sz w:val="18"/>
         </w:rPr>
-        <w:t>[Insert screenshot: screenshots/swagger.png - Figure 10 - Swagger UI for the API]</w:t>
+        <w:t>Figure 11 - Docker build, run and a /predict request</w:t>
+      </w:r>
+    </w:p>
+    <w:p>
+      <w:pPr>
+        <w:jc w:val="center"/>
+      </w:pPr>
+      <w:r>
+        <w:drawing>
+          <wp:inline xmlns:a="http://schemas.openxmlformats.org/drawingml/2006/main" xmlns:pic="http://schemas.openxmlformats.org/drawingml/2006/picture">
+            <wp:extent cx="5486400" cy="2785589"/>
+            <wp:docPr id="12" name="Picture 12"/>
+            <wp:cNvGraphicFramePr>
+              <a:graphicFrameLocks noChangeAspect="1"/>
+            </wp:cNvGraphicFramePr>
+            <a:graphic>
+              <a:graphicData uri="http://schemas.openxmlformats.org/drawingml/2006/picture">
+                <pic:pic>
+                  <pic:nvPicPr>
+                    <pic:cNvPr id="0" name="swagger.png"/>
+                    <pic:cNvPicPr/>
+                  </pic:nvPicPr>
+                  <pic:blipFill>
+                    <a:blip r:embed="rId20"/>
+                    <a:stretch>
+                      <a:fillRect/>
+                    </a:stretch>
+                  </pic:blipFill>
+                  <pic:spPr>
+                    <a:xfrm>
+                      <a:off x="0" y="0"/>
+                      <a:ext cx="5486400" cy="2785589"/>
+                    </a:xfrm>
+                    <a:prstGeom prst="rect"/>
+                  </pic:spPr>
+                </pic:pic>
+              </a:graphicData>
+            </a:graphic>
+          </wp:inline>
+        </w:drawing>
+      </w:r>
+    </w:p>
+    <w:p>
+      <w:pPr>
+        <w:jc w:val="center"/>
+      </w:pPr>
+      <w:r>
+        <w:rPr>
+          <w:i/>
+          <w:sz w:val="18"/>
+        </w:rPr>
+        <w:t>Figure 12 - Swagger UI for the API</w:t>
       </w:r>
     </w:p>
     <w:p>
@@ -1579,7 +1915,7 @@
           <w:b w:val="0"/>
           <w:i w:val="0"/>
         </w:rPr>
-        <w:t>The image is deployed to a local Minikube cluster (Docker driver) using the manifests in k8s/:</w:t>
+        <w:t>The image is deployed to a Minikube cluster (Docker driver) using the manifests in k8s/:</w:t>
       </w:r>
     </w:p>
     <w:p>
@@ -1617,13 +1953,15 @@
         </w:rPr>
         <w:t>minikube start -p heart-disease --driver=docker</w:t>
         <w:br/>
+        <w:t>minikube -p heart-disease image load heart-disease-api:1.0</w:t>
+        <w:br/>
         <w:t>kubectl apply -f k8s/deployment.yaml</w:t>
         <w:br/>
         <w:t>minikube -p heart-disease addons enable ingress</w:t>
         <w:br/>
         <w:t>kubectl apply -f k8s/ingress.yaml</w:t>
         <w:br/>
-        <w:t>minikube -p heart-disease tunnel      # exposes the ingress / LoadBalancer on 127.0.0.1</w:t>
+        <w:t>curl http://$(minikube -p heart-disease ip)/health</w:t>
       </w:r>
     </w:p>
     <w:p>
@@ -1632,7 +1970,46 @@
           <w:b w:val="0"/>
           <w:i w:val="0"/>
         </w:rPr>
-        <w:t>Verification: both pods reach Running, the Service receives the external IP 127.0.0.1 through the tunnel, and /health and /predict return the same results as the plain Docker container (prediction 0, confidence 0.834).</w:t>
+        <w:t>Verification: both pods reach Running and the Ingress receives the address of the Minikube node. /health and /predict called through the Ingress return the same results as the plain Docker container (prediction 0, confidence 0.834). The LoadBalancer Service keeps an EXTERNAL-IP of &lt;pending&gt; because Minikube has no cloud load balancer; the Ingress is the access path.</w:t>
+      </w:r>
+    </w:p>
+    <w:p>
+      <w:pPr>
+        <w:jc w:val="center"/>
+      </w:pPr>
+      <w:r>
+        <w:drawing>
+          <wp:inline xmlns:a="http://schemas.openxmlformats.org/drawingml/2006/main" xmlns:pic="http://schemas.openxmlformats.org/drawingml/2006/picture">
+            <wp:extent cx="5486400" cy="1616891"/>
+            <wp:docPr id="13" name="Picture 13"/>
+            <wp:cNvGraphicFramePr>
+              <a:graphicFrameLocks noChangeAspect="1"/>
+            </wp:cNvGraphicFramePr>
+            <a:graphic>
+              <a:graphicData uri="http://schemas.openxmlformats.org/drawingml/2006/picture">
+                <pic:pic>
+                  <pic:nvPicPr>
+                    <pic:cNvPr id="0" name="k8s_resources.png"/>
+                    <pic:cNvPicPr/>
+                  </pic:nvPicPr>
+                  <pic:blipFill>
+                    <a:blip r:embed="rId21"/>
+                    <a:stretch>
+                      <a:fillRect/>
+                    </a:stretch>
+                  </pic:blipFill>
+                  <pic:spPr>
+                    <a:xfrm>
+                      <a:off x="0" y="0"/>
+                      <a:ext cx="5486400" cy="1616891"/>
+                    </a:xfrm>
+                    <a:prstGeom prst="rect"/>
+                  </pic:spPr>
+                </pic:pic>
+              </a:graphicData>
+            </a:graphic>
+          </wp:inline>
+        </w:drawing>
       </w:r>
     </w:p>
     <w:p>
@@ -1641,22 +2018,10 @@
       </w:pPr>
       <w:r>
         <w:rPr>
-          <w:b/>
-          <w:color w:val="C0392B"/>
+          <w:i/>
+          <w:sz w:val="18"/>
         </w:rPr>
-        <w:t>[Insert screenshot: screenshots/k8s_resources.png - Figure 11 - kubectl get pods, svc and ingress]</w:t>
-      </w:r>
-    </w:p>
-    <w:p>
-      <w:pPr>
-        <w:jc w:val="center"/>
-      </w:pPr>
-      <w:r>
-        <w:rPr>
-          <w:b/>
-          <w:color w:val="C0392B"/>
-        </w:rPr>
-        <w:t>[Insert screenshot: screenshots/predict_ingress.png - Figure 12 - /predict called through the Ingress]</w:t>
+        <w:t>Figure 13 - kubectl get pods, svc and ingress, the /metrics counters and the request logs of the pods</w:t>
       </w:r>
     </w:p>
     <w:p>
@@ -1728,11 +2093,38 @@
         <w:jc w:val="center"/>
       </w:pPr>
       <w:r>
-        <w:rPr>
-          <w:b/>
-          <w:color w:val="C0392B"/>
-        </w:rPr>
-        <w:t>[Insert screenshot: screenshots/prometheus_targets.png - Figure 13 - Prometheus target heart-disease-api is UP]</w:t>
+        <w:drawing>
+          <wp:inline xmlns:a="http://schemas.openxmlformats.org/drawingml/2006/main" xmlns:pic="http://schemas.openxmlformats.org/drawingml/2006/picture">
+            <wp:extent cx="5486400" cy="2758125"/>
+            <wp:docPr id="14" name="Picture 14"/>
+            <wp:cNvGraphicFramePr>
+              <a:graphicFrameLocks noChangeAspect="1"/>
+            </wp:cNvGraphicFramePr>
+            <a:graphic>
+              <a:graphicData uri="http://schemas.openxmlformats.org/drawingml/2006/picture">
+                <pic:pic>
+                  <pic:nvPicPr>
+                    <pic:cNvPr id="0" name="prometheus_targets.png"/>
+                    <pic:cNvPicPr/>
+                  </pic:nvPicPr>
+                  <pic:blipFill>
+                    <a:blip r:embed="rId22"/>
+                    <a:stretch>
+                      <a:fillRect/>
+                    </a:stretch>
+                  </pic:blipFill>
+                  <pic:spPr>
+                    <a:xfrm>
+                      <a:off x="0" y="0"/>
+                      <a:ext cx="5486400" cy="2758125"/>
+                    </a:xfrm>
+                    <a:prstGeom prst="rect"/>
+                  </pic:spPr>
+                </pic:pic>
+              </a:graphicData>
+            </a:graphic>
+          </wp:inline>
+        </w:drawing>
       </w:r>
     </w:p>
     <w:p>
@@ -1741,10 +2133,61 @@
       </w:pPr>
       <w:r>
         <w:rPr>
-          <w:b/>
-          <w:color w:val="C0392B"/>
+          <w:i/>
+          <w:sz w:val="18"/>
         </w:rPr>
-        <w:t>[Insert screenshot: screenshots/grafana_dashboard.png - Figure 14 - Grafana dashboard]</w:t>
+        <w:t>Figure 14 - Prometheus target heart-disease-api is UP</w:t>
+      </w:r>
+    </w:p>
+    <w:p>
+      <w:pPr>
+        <w:jc w:val="center"/>
+      </w:pPr>
+      <w:r>
+        <w:drawing>
+          <wp:inline xmlns:a="http://schemas.openxmlformats.org/drawingml/2006/main" xmlns:pic="http://schemas.openxmlformats.org/drawingml/2006/picture">
+            <wp:extent cx="5486400" cy="2304632"/>
+            <wp:docPr id="15" name="Picture 15"/>
+            <wp:cNvGraphicFramePr>
+              <a:graphicFrameLocks noChangeAspect="1"/>
+            </wp:cNvGraphicFramePr>
+            <a:graphic>
+              <a:graphicData uri="http://schemas.openxmlformats.org/drawingml/2006/picture">
+                <pic:pic>
+                  <pic:nvPicPr>
+                    <pic:cNvPr id="0" name="grafana_dashboard.png"/>
+                    <pic:cNvPicPr/>
+                  </pic:nvPicPr>
+                  <pic:blipFill>
+                    <a:blip r:embed="rId23"/>
+                    <a:stretch>
+                      <a:fillRect/>
+                    </a:stretch>
+                  </pic:blipFill>
+                  <pic:spPr>
+                    <a:xfrm>
+                      <a:off x="0" y="0"/>
+                      <a:ext cx="5486400" cy="2304632"/>
+                    </a:xfrm>
+                    <a:prstGeom prst="rect"/>
+                  </pic:spPr>
+                </pic:pic>
+              </a:graphicData>
+            </a:graphic>
+          </wp:inline>
+        </w:drawing>
+      </w:r>
+    </w:p>
+    <w:p>
+      <w:pPr>
+        <w:jc w:val="center"/>
+      </w:pPr>
+      <w:r>
+        <w:rPr>
+          <w:i/>
+          <w:sz w:val="18"/>
+        </w:rPr>
+        <w:t>Figure 15 - Grafana dashboard</w:t>
       </w:r>
     </w:p>
     <w:p>
@@ -1763,7 +2206,7 @@
         <w:drawing>
           <wp:inline xmlns:a="http://schemas.openxmlformats.org/drawingml/2006/main" xmlns:pic="http://schemas.openxmlformats.org/drawingml/2006/picture">
             <wp:extent cx="5943600" cy="2485505"/>
-            <wp:docPr id="5" name="Picture 5"/>
+            <wp:docPr id="16" name="Picture 16"/>
             <wp:cNvGraphicFramePr>
               <a:graphicFrameLocks noChangeAspect="1"/>
             </wp:cNvGraphicFramePr>
@@ -1775,7 +2218,7 @@
                     <pic:cNvPicPr/>
                   </pic:nvPicPr>
                   <pic:blipFill>
-                    <a:blip r:embed="rId13"/>
+                    <a:blip r:embed="rId24"/>
                     <a:stretch>
                       <a:fillRect/>
                     </a:stretch>
@@ -1803,7 +2246,7 @@
           <w:i/>
           <w:sz w:val="18"/>
         </w:rPr>
-        <w:t>Figure 15 - End-to-end architecture</w:t>
+        <w:t>Figure 16 - End-to-end architecture</w:t>
       </w:r>
     </w:p>
     <w:p>
@@ -1852,7 +2295,7 @@
         <w:pStyle w:val="ListBullet"/>
       </w:pPr>
       <w:r>
-        <w:t>Port 3000 was already in use locally, so Grafana is exposed on port 3001.</w:t>
+        <w:t>Port 3000 was already in use on the development machine, so Grafana is exposed on port 3001.</w:t>
       </w:r>
     </w:p>
     <w:p>
@@ -1927,7 +2370,7 @@
         <w:pStyle w:val="ListBullet"/>
       </w:pPr>
       <w:r>
-        <w:t>Local API (Docker): http://localhost:8000 (docs at /docs).</w:t>
+        <w:t>API (Docker): http://localhost:8000 (docs at /docs).</w:t>
       </w:r>
     </w:p>
     <w:p>
@@ -1935,7 +2378,7 @@
         <w:pStyle w:val="ListBullet"/>
       </w:pPr>
       <w:r>
-        <w:t>Local Kubernetes: http://127.0.0.1/ while 'minikube tunnel' is running, or 'kubectl -n heart-disease port-forward svc/heart-disease-api 8080:80'.</w:t>
+        <w:t>Kubernetes: through the Ingress at the Minikube IP ('minikube ip'), or 'kubectl -n heart-disease port-forward svc/heart-disease-api 8080:80'.</w:t>
       </w:r>
     </w:p>
     <w:p>

</xml_diff>